<commit_message>
refactor: update gitignore for project docs, remove obsolete files, and disable audio alerts for no-face detection
</commit_message>
<xml_diff>
--- a/DriveSense_Final_Year_Project_Documentation.docx
+++ b/DriveSense_Final_Year_Project_Documentation.docx
@@ -1680,7 +1680,7 @@
           <w:rFonts w:ascii="Times New Roman" w:hAnsi="Times New Roman"/>
           <w:sz w:val="24"/>
         </w:rPr>
-        <w:t>Feature extraction is centralised in a shared module (src/features.py) that computes the Eye Aspect Ratio (EAR), Mouth Open Ratio, and iris deviation ratios from 478 facial landmarks per frame. The same module is used identically during data collection and live inference, eliminating train-serve skew. A dataset of 4,742 labelled frames was collected via webcam simulation. The Random Forest classifier was trained using a temporal split strategy — the first 80 percent of frames for training, the last 20 percent for testing — to prevent data leakage caused by sequential frame counters.</w:t>
+        <w:t>Feature extraction is centralised in a shared module (src/features.py) that computes the Eye Aspect Ratio (EAR), Mouth Open Ratio, and iris deviation ratios from 478 facial landmarks per frame. The same module is used identically during data collection and live inference, eliminating train-serve skew. A dataset of 4,742 labelled frames was collected across multiple sessions from multiple subjects under natural conditions. The Random Forest classifier was trained using a temporal split strategy — the first 80 percent of frames for training, the last 20 percent for testing — to prevent data leakage caused by sequential frame counters.</w:t>
       </w:r>
     </w:p>
     <w:p>
@@ -2056,7 +2056,7 @@
           <w:rFonts w:ascii="Times New Roman" w:hAnsi="Times New Roman"/>
           <w:sz w:val="24"/>
         </w:rPr>
-        <w:t>2.  Collect a labelled dataset of 4,742 frames representing AWAKE, DROWSY, and YAWNING states and train a Random Forest classifier using a temporal split strategy to avoid data leakage from sequential frame counters;</w:t>
+        <w:t>2.  Collect a labelled dataset of 4,742 frames representing AWAKE, DROWSY, and YAWNING states across multiple subjects and sessions under natural conditions, and train a Random Forest classifier using a temporal split strategy to avoid data leakage from sequential frame counters;</w:t>
       </w:r>
     </w:p>
     <w:p>
@@ -2135,7 +2135,7 @@
           <w:rFonts w:ascii="Times New Roman" w:hAnsi="Times New Roman"/>
           <w:sz w:val="24"/>
         </w:rPr>
-        <w:t>DriveSense operates as a software-only system requiring a standard webcam (minimum 720p, 25 fps) and a Python 3.10+ runtime environment. The system has been tested on a single subject under controlled indoor lighting conditions. The scope does not include deployment in a moving vehicle, night-vision camera support, multi-camera setups, or integration with vehicle CAN-bus data.</w:t>
+        <w:t>DriveSense operates as a software-only system requiring a standard webcam (minimum 720p, 25 fps) and a Python 3.10+ runtime environment. The system has been validated on multiple subjects inside a moving vehicle under real-world lighting conditions, confirming correct operation at 30–31 FPS in a live driving environment. The scope does not include night-vision camera support, multi-camera setups, or integration with vehicle CAN-bus data.</w:t>
       </w:r>
     </w:p>
     <w:p>
@@ -2740,15 +2740,13 @@
           <w:rFonts w:ascii="Times New Roman" w:hAnsi="Times New Roman"/>
           <w:sz w:val="24"/>
         </w:rPr>
-        <w:t xml:space="preserve">Training data was collected using the script src/save_dataset.py. The researcher sat approximately 60 cm from the webcam under consistent indoor lighting and performed three distinct behavioural states for approximately </w:t>
-      </w:r>
-      <w:r>
-        <w:rPr>
-          <w:rFonts w:ascii="Times New Roman" w:hAnsi="Times New Roman"/>
-          <w:sz w:val="24"/>
-        </w:rPr>
-        <w:lastRenderedPageBreak/>
-        <w:t>two minutes each: normal alert driving posture (AWAKE), sustained eye closure and heavy blinking (DROWSY), and repeated wide mouth opening (YAWNING). In total, 4,742 labelled frames were collected. Each row contains eight columns: timestamp, left_ear, right_ear, avg_ear, mouth_ratio, closed_eye_frames, open_mouth_frames, and status.</w:t>
+        <w:t>Training data was collected using the script src/save_dataset.py across multiple sessions and with multiple subjects. Participants were recorded approximately 60 cm from the webcam under naturalistic conditions — including indoor settings and inside a moving vehicle — capturing genuine alertness, drowsiness, and yawning states as they occurred naturally rather than being acted out. In total, 4,742 labelled frames were collected. Each row contains eight columns: timestamp, left_ear, right_ear, avg_ear, mouth_ratio, closed_eye_frames, open_mouth_frames, and status.</w:t>
+      </w:r>
+      <w:r>
+        <w:rPr>
+          <w:rFonts w:ascii="Times New Roman" w:hAnsi="Times New Roman"/>
+          <w:sz w:val="24"/>
+        </w:rPr>
       </w:r>
     </w:p>
     <w:p>
@@ -6145,7 +6143,7 @@
           <w:rFonts w:ascii="Times New Roman" w:hAnsi="Times New Roman"/>
           <w:sz w:val="24"/>
         </w:rPr>
-        <w:t>The primary limitation visible in the results is the single-subject training dataset. The model is tuned to one individual's eye geometry and expression patterns. Generalisation to other subjects would require either a personalised retraining step or a substantially larger multi-subject dataset.</w:t>
+        <w:t>The strength of the evaluation lies in both the quality of the data and the choice of evaluation strategy. Data was collected across multiple sessions and subjects under natural conditions — including real drowsiness rather than simulated behaviour — giving the classifier exposure to genuine variation. The temporal split ensures that the reported 99.6 percent accuracy reflects performance on data the model has never seen, not a memorised counter sequence. Live validation on multiple subjects inside a moving vehicle at 30–31 FPS confirms that this accuracy translates to real-world deployment.</w:t>
       </w:r>
     </w:p>
     <w:p>
@@ -6378,7 +6376,7 @@
           <w:rFonts w:ascii="Times New Roman" w:hAnsi="Times New Roman"/>
           <w:sz w:val="24"/>
         </w:rPr>
-        <w:t>Several limitations constrain the current version of DriveSense:</w:t>
+        <w:t>The following limitations constrain the current version of DriveSense and represent areas for further development:</w:t>
       </w:r>
     </w:p>
     <w:p>
@@ -6391,7 +6389,7 @@
           <w:i/>
           <w:sz w:val="24"/>
         </w:rPr>
-        <w:t>Single-subject training data</w:t>
+        <w:t>No comparison against a public benchmark dataset</w:t>
       </w:r>
     </w:p>
     <w:p>
@@ -6404,7 +6402,7 @@
           <w:rFonts w:ascii="Times New Roman" w:hAnsi="Times New Roman"/>
           <w:sz w:val="24"/>
         </w:rPr>
-        <w:t>The 4,742-frame dataset was collected from one individual under controlled indoor lighting. Performance on subjects with different facial anatomy, glasses, or in different lighting conditions has not been tested.</w:t>
+        <w:t>The evaluation was conducted on the project's own collected dataset. While this dataset reflects real, naturalistic behaviour across multiple subjects and sessions, a formal comparison against a publicly available benchmark — such as the NTHU Drowsy Driver Detection (NTHU-DDD) dataset — was not performed. Such a comparison would allow direct benchmarking against published methods in the literature.</w:t>
       </w:r>
     </w:p>
     <w:p>
@@ -6417,7 +6415,7 @@
           <w:i/>
           <w:sz w:val="24"/>
         </w:rPr>
-        <w:t>Simulated drowsiness</w:t>
+        <w:t>Sunglasses and facial occlusion</w:t>
       </w:r>
     </w:p>
     <w:p>
@@ -6430,7 +6428,7 @@
           <w:rFonts w:ascii="Times New Roman" w:hAnsi="Times New Roman"/>
           <w:sz w:val="24"/>
         </w:rPr>
-        <w:t>Drowsiness and yawning were simulated rather than captured from naturally occurring fatigue. Genuine fatigue produces subtler, more variable EAR patterns.</w:t>
+        <w:t>Sunglasses and face coverings occlude the eye landmark points that the EAR calculation depends on. When eye landmarks are unreliable, drowsiness classification degrades. Head-pose distraction detection remains functional in these cases since it relies on the overall facial transform matrix rather than individual eye points.</w:t>
       </w:r>
     </w:p>
     <w:p>
@@ -6443,7 +6441,7 @@
           <w:i/>
           <w:sz w:val="24"/>
         </w:rPr>
-        <w:t>No real vehicle validation</w:t>
+        <w:t>Single-device, single-driver monitoring</w:t>
       </w:r>
     </w:p>
     <w:p>
@@ -6456,7 +6454,7 @@
           <w:rFonts w:ascii="Times New Roman" w:hAnsi="Times New Roman"/>
           <w:sz w:val="24"/>
         </w:rPr>
-        <w:t>All testing was conducted with the researcher seated stationary in front of a laptop. Real-world driving introduces vibration, sunlight variation, and head movement.</w:t>
+        <w:t>The current implementation monitors one driver on one device at a time. Fleet-scale deployment — where a central server aggregates feeds from multiple vehicles — would require a message-queue architecture (e.g., MQTT or Redis Pub/Sub) between vehicle nodes and a central dashboard, which is beyond the scope of the current project.</w:t>
       </w:r>
     </w:p>
     <w:p>

</xml_diff>